<commit_message>
AI-napló: M1 leadás bejegyzés; terv: entitásszám frissítése (21)
</commit_message>
<xml_diff>
--- a/Modositott_terv.docx
+++ b/Modositott_terv.docx
@@ -43,15 +43,7 @@
           <w:iCs/>
           <w:color w:val="666666"/>
         </w:rPr>
-        <w:t xml:space="preserve">Készítette: Szombati Konrád (IJKCKR) • Tervezett befejezés: 2026. december 12. (hivatalos leadási </w:t>
-      </w:r>
-      <w:r>
-        <w:rPr>
-          <w:i/>
-          <w:iCs/>
-          <w:color w:val="666666"/>
-        </w:rPr>
-        <w:t>határidő: december 19.) • Tervezett ráfordítás: heti 10–12 óra</w:t>
+        <w:t>Készítette: Szombati Konrád (IJKCKR) • Tervezett befejezés: 2026. december 12. (hivatalos leadási határidő: december 19.) • Tervezett ráfordítás: heti 10–12 óra</w:t>
       </w:r>
     </w:p>
     <w:p>
@@ -79,13 +71,7 @@
         <w:rPr>
           <w:color w:val="000000"/>
         </w:rPr>
-        <w:t>A terv a visszajelzésben megfogalmazott öt szakmai elvárásra tételesen reagál. A rendszer két központi szakmai modulja a konfigurálható és magyarázható szabálykiértékelés, valamint a verziózott kérdőívek és személyre szabott követési tervek; ezekre épül a teljes riasztáskezelési folyamat, a bizonyított jogosultságkezelés és a rendszer mérésekkel alátámasztott kiértékelése.</w:t>
-      </w:r>
-      <w:r>
-        <w:rPr>
-          <w:color w:val="000000"/>
-        </w:rPr>
-        <w:t xml:space="preserve"> Az alap technológiai vállalás változatlan: React + TypeScript kliens, Python + FastAPI szerver, PostgreSQL adatbázis, Docker, teljes CI/CD, unit és folyamat-szintű tesztek, Swagger/OpenAPI dokumentáció.</w:t>
+        <w:t>A terv a visszajelzésben megfogalmazott öt szakmai elvárásra tételesen reagál. A rendszer két központi szakmai modulja a konfigurálható és magyarázható szabálykiértékelés, valamint a verziózott kérdőívek és személyre szabott követési tervek; ezekre épül a teljes riasztáskezelési folyamat, a bizonyított jogosultságkezelés és a rendszer mérésekkel alátámasztott kiértékelése. Az alap technológiai vállalás változatlan: React + TypeScript kliens, Python + FastAPI szerver, PostgreSQL adatbázis, Docker, teljes CI/CD, unit és folyamat-szintű tesztek, Swagger/OpenAPI dokumentáció.</w:t>
       </w:r>
     </w:p>
     <w:p>
@@ -389,13 +375,7 @@
         <w:rPr>
           <w:color w:val="000000"/>
         </w:rPr>
-        <w:t>A beteg–orvos–admin</w:t>
-      </w:r>
-      <w:r>
-        <w:rPr>
-          <w:color w:val="000000"/>
-        </w:rPr>
-        <w:t xml:space="preserve"> szerepkörök jogosultságai szerveroldalon, minden végponton érvényesülnek: a lekérdezések kötelezően szűrnek a bejelentkezett felhasználó jogosultsági körére (beteg: kizárólag saját adat; orvos: kizárólag a hozzárendelt betegek; admin: adminisztratív erőforrások).</w:t>
+        <w:t>A beteg–orvos–admin szerepkörök jogosultságai szerveroldalon, minden végponton érvényesülnek: a lekérdezések kötelezően szűrnek a bejelentkezett felhasználó jogosultsági körére (beteg: kizárólag saját adat; orvos: kizárólag a hozzárendelt betegek; admin: adminisztratív erőforrások).</w:t>
       </w:r>
     </w:p>
     <w:p>
@@ -509,19 +489,7 @@
         <w:rPr>
           <w:color w:val="000000"/>
         </w:rPr>
-        <w:t>A kiértékelés a szoftver működését vizsgálja; a rendszer klinikai hasznosságáról nem tesz megállapítást.</w:t>
-      </w:r>
-      <w:r>
-        <w:rPr>
-          <w:color w:val="000000"/>
-        </w:rPr>
-        <w:t xml:space="preserve"> A nyilvános demókörnyezet kizárólag mesterséges tesztadatokat</w:t>
-      </w:r>
-      <w:r>
-        <w:rPr>
-          <w:color w:val="000000"/>
-        </w:rPr>
-        <w:t xml:space="preserve"> tartalmaz, és a felületen, valamint a dolgozatban egyértelműen rögzítve lesz: demonstrációs rendszer, amely nem helyettesít orvosi döntést vagy sürgősségi ellátást.</w:t>
+        <w:t>A kiértékelés a szoftver működését vizsgálja; a rendszer klinikai hasznosságáról nem tesz megállapítást. A nyilvános demókörnyezet kizárólag mesterséges tesztadatokat tartalmaz, és a felületen, valamint a dolgozatban egyértelműen rögzítve lesz: demonstrációs rendszer, amely nem helyettesít orvosi döntést vagy sürgősségi ellátást.</w:t>
       </w:r>
     </w:p>
     <w:p>
@@ -853,15 +821,7 @@
                 <w:sz w:val="19"/>
                 <w:szCs w:val="19"/>
               </w:rPr>
-              <w:t>A két központi modul teljes kidolgozása (szabálykiértékelés a négy szabálytípussal, verziózással</w:t>
-            </w:r>
-            <w:r>
-              <w:rPr>
-                <w:color w:val="000000"/>
-                <w:sz w:val="19"/>
-                <w:szCs w:val="19"/>
-              </w:rPr>
-              <w:t xml:space="preserve"> és magyarázattal; kérdőívszerkesztő verziózással és követési tervekkel), riasztás-életút, jogosultsági folyamatok és célzott tesztjeik</w:t>
+              <w:t>A két központi modul teljes kidolgozása (szabálykiértékelés a négy szabálytípussal, verziózással és magyarázattal; kérdőívszerkesztő verziózással és követési tervekkel), riasztás-életút, jogosultsági folyamatok és célzott tesztjeik</w:t>
             </w:r>
           </w:p>
         </w:tc>
@@ -1185,7 +1145,23 @@
                 <w:sz w:val="19"/>
                 <w:szCs w:val="19"/>
               </w:rPr>
-              <w:t>Verziózott szabályok és kérdőívek, kirendelések, riasztás-eseménytörténet (~14 entitás); relációs vs NoSQL elemzés</w:t>
+              <w:t xml:space="preserve">Verziózott szabályok és kérdőívek, kirendelések, riasztás-eseménytörténet </w:t>
+            </w:r>
+            <w:r>
+              <w:rPr>
+                <w:color w:val="000000"/>
+                <w:sz w:val="19"/>
+                <w:szCs w:val="19"/>
+              </w:rPr>
+              <w:t>(21 entitás)</w:t>
+            </w:r>
+            <w:r>
+              <w:rPr>
+                <w:color w:val="000000"/>
+                <w:sz w:val="19"/>
+                <w:szCs w:val="19"/>
+              </w:rPr>
+              <w:t>; relációs vs NoSQL elemzés</w:t>
             </w:r>
           </w:p>
         </w:tc>
@@ -1588,15 +1564,7 @@
                 <w:sz w:val="19"/>
                 <w:szCs w:val="19"/>
               </w:rPr>
-              <w:t xml:space="preserve">CI-ben futó </w:t>
-            </w:r>
-            <w:r>
-              <w:rPr>
-                <w:color w:val="000000"/>
-                <w:sz w:val="19"/>
-                <w:szCs w:val="19"/>
-              </w:rPr>
-              <w:t>tesztkészlet, lefedettségi riport</w:t>
+              <w:t>CI-ben futó tesztkészlet, lefedettségi riport</w:t>
             </w:r>
           </w:p>
         </w:tc>
@@ -1852,13 +1820,7 @@
         <w:rPr>
           <w:color w:val="000000"/>
         </w:rPr>
-        <w:t>A fejlesztéshez Claude Code</w:t>
-      </w:r>
-      <w:r>
-        <w:rPr>
-          <w:color w:val="000000"/>
-        </w:rPr>
-        <w:t>-ot használok. A repóban AI-használati naplót vezetek (dátum, feladat, mire használtam az eszközt, mit fogadtam el a javaslataiból, hogyan ellenőriztem — tesztekkel, kézi átvizsgálással, dokumentáció alapján). A dolgozat külön alfejezetben mutatja be az eszköz szerepét; a tervezési döntések és a kód működésének ismerete és indoklása a saját felelősségem.</w:t>
+        <w:t>A fejlesztéshez Claude Code-ot használok. A repóban AI-használati naplót vezetek (dátum, feladat, mire használtam az eszközt, mit fogadtam el a javaslataiból, hogyan ellenőriztem — tesztekkel, kézi átvizsgálással, dokumentáció alapján). A dolgozat külön alfejezetben mutatja be az eszköz szerepét; a tervezési döntések és a kód működésének ismerete és indoklása a saját felelősségem.</w:t>
       </w:r>
     </w:p>
     <w:p>

</xml_diff>

<commit_message>
M1 pontosítása a témavezetői visszajelzés alapján
- Adatmodell: kirendelés-alkalom tábla, riasztás-deduplikáció szabály
  szerint, eseményszintű szabályverzió és kiváltó adat, pontozási irány
- Új fejezet: működési szabályok példákon (státusz, esedékesség,
  verzióváltás és javítás, pontozás)
- Követelmények, folyamatábrák, képernyővázlatok, ütemterv frissítve;
  ábraforrások a docs/M1/abrak mappában
- Módosított terv: kiértékelési forgatókönyvek és állapotleírás javítva
- Státuszjelölés tervezési anyagai (docs/design); AI-napló frissítve
</commit_message>
<xml_diff>
--- a/Modositott_terv.docx
+++ b/Modositott_terv.docx
@@ -125,7 +125,10 @@
         <w:spacing w:after="60" w:line="280" w:lineRule="auto"/>
       </w:pPr>
       <w:r>
-        <w:t>Időablakos ismétlődés: legalább N darab eltérő mérés M napon belül (paraméterek: méréstípus, határok, N, M, súlyosság) — az egyszeri kiugrás és a tartós romlás megkülönböztetésére.</w:t>
+        <w:t xml:space="preserve">Időablakos ismétlődés: legalább N darab eltérő mérés M napon belül (paraméterek: méréstípus, határok, N, M, súlyosság) — </w:t>
+      </w:r>
+      <w:r>
+        <w:t>az egyszeri kiugrás és a tartós, ismétlődő eltérés megkülönböztetésére.</w:t>
       </w:r>
     </w:p>
     <w:p>
@@ -191,7 +194,13 @@
         <w:rPr>
           <w:color w:val="000000"/>
         </w:rPr>
-        <w:t>Az utólag javított mérés (a beteg elírta, majd módosította) új kiértékelést vált ki: a rendszer újrafuttatja az érintett szabályokat, a korábbi jelzés eseménytörténetében pedig rögzíti az adatmódosítás tényét. A beteg összesített státusza (zöld/sárga/piros/szürke) a nyitott jelzések súlyosságából és az adathiány-jelzésekből származik; a szürke státusz kifejezetten az „nincs elég friss adat" állapotot jelzi.</w:t>
+        <w:t xml:space="preserve">Az utólag javított mérés (a beteg elírta, majd módosította) új kiértékelést vált ki: a rendszer újrafuttatja az érintett szabályokat, a korábbi jelzés eseménytörténetében pedig rögzíti az adatmódosítás tényét. </w:t>
+      </w:r>
+      <w:r>
+        <w:rPr>
+          <w:color w:val="000000"/>
+        </w:rPr>
+        <w:t>A beteg státusza (Súlyos, Figyelem, Adathiány, Kezelve, Rendben) a nyitott riasztásokból, az alkalmak teljesítéséből és a lezárás utáni megerősítő adatból számítódik; az Adathiány a „nincs elég friss adat” állapotot jelzi.</w:t>
       </w:r>
     </w:p>
     <w:p>
@@ -267,7 +276,10 @@
         <w:spacing w:after="60" w:line="280" w:lineRule="auto"/>
       </w:pPr>
       <w:r>
-        <w:t>Követési terv: az orvos betegre szabottan állítja be, milyen méréseket és mely kérdőíveket, milyen gyakorisággal és határidővel vár. A kirendelés életciklusa kezelt: kirendelve → esedékes → teljesítve / elmulasztva; az elmulasztás az 1. pont szerinti adathiány-szabályt aktiválja.</w:t>
+        <w:t xml:space="preserve">Követési terv: az orvos betegre szabottan állítja be, milyen méréseket és mely kérdőíveket, milyen gyakorisággal és határidővel vár. </w:t>
+      </w:r>
+      <w:r>
+        <w:t>Az előírás egyes alkalmai külön rögzülnek (esedékes → teljesítve / késve teljesítve / elmulasztva); a határidőket ütemezett háttérfolyamat ellenőrzi, az elmulasztás az 1. pont szerinti adathiány-szabályt aktiválja.</w:t>
       </w:r>
     </w:p>
     <w:p>
@@ -347,7 +359,10 @@
         <w:spacing w:after="60" w:line="280" w:lineRule="auto"/>
       </w:pPr>
       <w:r>
-        <w:t>A riasztás lezárása nem azonos a beteg állapotjelzésével: a státusz a nyitott jelzésekből számítódik újra, a lezárt riasztás pedig az előzményekben marad.</w:t>
+        <w:t xml:space="preserve">A riasztás lezárása nem azonos a beteg állapotjelzésével: </w:t>
+      </w:r>
+      <w:r>
+        <w:t>a lezárás után a beteg a megerősítő adat beérkezéséig Kezelve státuszú, a lezárt riasztás pedig az előzményekben marad.</w:t>
       </w:r>
     </w:p>
     <w:p>
@@ -451,7 +466,13 @@
         <w:rPr>
           <w:color w:val="000000"/>
         </w:rPr>
-        <w:t>A dolgozat külön fejezetben, előre meghatározott mesterséges adatsorokon értékeli a rendszert. Egy szintetikus adatgenerátor előre definiált beteg-forgatókönyveket állít elő (pl. stabil beteg; egyszeri kiugrás; lassan romló trend; adathiányos időszak; romló kérdőív-pontszám stabil mérések mellett; utólag javított adat).</w:t>
+        <w:t xml:space="preserve">A dolgozat külön fejezetben, előre meghatározott mesterséges adatsorokon értékeli a rendszert. Egy szintetikus adatgenerátor előre definiált beteg-forgatókönyveket állít elő </w:t>
+      </w:r>
+      <w:r>
+        <w:rPr>
+          <w:color w:val="000000"/>
+        </w:rPr>
+        <w:t>(stabil beteg; egyszeri kiugrás; tartós, ismétlődő küszöbátlépés; adathiányos időszak; a határ alatt romló kérdőív-pontszám; utólag javított adat).</w:t>
       </w:r>
     </w:p>
     <w:p>
@@ -464,7 +485,10 @@
         <w:spacing w:after="60" w:line="280" w:lineRule="auto"/>
       </w:pPr>
       <w:r>
-        <w:t>Összehasonlítás: ugyanazon adatsorokon lefut az egyszerű küszöbfigyelés (alapvonal) és a szabálykiértékelés; a fejezet bemutatja, mely forgatókönyveknél és miért adnak eltérő jelzést (pl. az egyszeri kiugrást a küszöb jelzi, a lassú romlást csak az időablakos szabály; az adathiányt a küszöbfigyelés egyáltalán nem érzékeli).</w:t>
+        <w:t xml:space="preserve">Összehasonlítás: ugyanazon adatsorokon lefut az egyszerű küszöbfigyelés (alapvonal) és a szabálykiértékelés; a fejezet bemutatja, mely forgatókönyveknél és miért adnak eltérő jelzést </w:t>
+      </w:r>
+      <w:r>
+        <w:t>(pl. egyszeri kiugrásra a küszöbfigyelés riaszt, a szabálykiértékelés nem; tartós eltérésnél a szabálykiértékelés kevesebb, összevont, de későbbi jelzést ad; az adathiányt a küszöbfigyelés nem érzékeli). Mérőszámok: a riasztások és az értesítések száma, az első jelzés időpontja, az adathiány felismerése. A mérések küszöb alatti, lassú romlását egyik módszer sem észleli; ez a korlátok között szerepel.</w:t>
       </w:r>
     </w:p>
     <w:p>

</xml_diff>